<commit_message>
Add CEA final public archive QA package
</commit_message>
<xml_diff>
--- a/manuscript/CEA_trust_router_R12_CEA_FORMATTED_20260620_second_reader_integrated.docx
+++ b/manuscript/CEA_trust_router_R12_CEA_FORMATTED_20260620_second_reader_integrated.docx
@@ -622,10 +622,7 @@
         <w:rPr/>
       </w:pPr>
       <w:r>
-        <w:rPr>
-          <w:rtl w:val="0"/>
-        </w:rPr>
-        <w:t xml:space="preserve">Four safeguards were used to keep weak labels from becoming hidden ground truth. First, weak products were retained in separate hint columns rather than overwriting the final class. Second, the final class was taken only from rows with `verified == True`. Third, provenance fields record the source reference, verification source, user confirmation status, and review notes. Fourth, weak products were audited after locking the labels, so their agreement or disagreement could not define the reported truth.</w:t>
+        <w:t>Four safeguards were used to keep weak labels from becoming hidden ground truth. First, weak products were retained in separate hint columns rather than overwriting the final class. Second, the final class was taken only from rows with `verified == True`. Third, provenance fields record the source reference, verification source, user confirmation status, and review notes. Fourth, weak products were audited after locking the labels, so their agreement or disagreement could not define the reported truth. Table 1 records the provenance fields that protect this distinction.</w:t>
       </w:r>
     </w:p>
     <w:p>
@@ -1044,10 +1041,7 @@
         <w:rPr/>
       </w:pPr>
       <w:r>
-        <w:rPr>
-          <w:rtl w:val="0"/>
-        </w:rPr>
-        <w:t xml:space="preserve">This limitation is important for CEA positioning. The experiments evaluate a sample-level decision layer and its evidence sufficiency under a strict reference file. They do not claim a full parcel-level map, a new field-survey campaign, or monetary field-cost savings. A future operational submission should add independently collected field or parcel labels under reported survey conditions; the present manuscript reports the decision-support method and the reproducible evidence gates that identify where such additional verification is needed.</w:t>
+        <w:t>This limitation is important for CEA positioning. The experiments evaluate a sample-level decision layer and its evidence sufficiency under a strict reference file. They do not claim a full parcel-level map, a new field-survey campaign, or monetary field-cost savings. A future operational submission should add independently collected field or parcel labels under reported survey conditions; the present manuscript reports the decision-support method and the reproducible evidence gates that identify where such additional verification is needed. Table 2 and Table 3 summarize the class and region denominators used by the evidence gates.</w:t>
       </w:r>
     </w:p>
     <w:p>
@@ -1708,10 +1702,7 @@
         <w:rPr/>
       </w:pPr>
       <w:r>
-        <w:rPr>
-          <w:rtl w:val="0"/>
-        </w:rPr>
-        <w:t xml:space="preserve">Four feature stacks were evaluated under identical preprocessing and fixed classifier settings. B0 used Sentinel-2 spectral and index features; B1 combined Sentinel-1 and Sentinel-2; B2 used the 64-dimensional AlphaEarth annual embedding; and B3 combined AlphaEarth with Sentinel-1/Sentinel-2. Random Forest was the primary classifier because the study objective was not per-stack hyperparameter optimization but the evaluation of a downstream trust and verification layer. XGBoost was run as a limited model-family robustness check on the same locked sample table, but the current CEA decision-layer outputs are reported for Random Forest because that is the implemented conformal-action pipeline.</w:t>
+        <w:t>Four feature stacks were evaluated under identical preprocessing and fixed classifier settings. B0 used Sentinel-2 spectral and index features; B1 combined Sentinel-1 and Sentinel-2; B2 used the 64-dimensional AlphaEarth annual embedding; and B3 combined AlphaEarth with Sentinel-1/Sentinel-2. Random Forest was the primary classifier because the study objective was not per-stack hyperparameter optimization but the evaluation of a downstream trust and verification layer. XGBoost was run as a limited model-family robustness check on the same locked sample table, but the current CEA decision-layer outputs are reported for Random Forest because that is the implemented conformal-action pipeline. Table 4 lists the feature stacks and their agricultural roles.</w:t>
       </w:r>
     </w:p>
     <w:p>
@@ -2219,10 +2210,7 @@
         <w:rPr/>
       </w:pPr>
       <w:r>
-        <w:rPr>
-          <w:rtl w:val="0"/>
-        </w:rPr>
-        <w:t xml:space="preserve">The trust-action layer is the central CEA contribution. The final pipeline uses class-conditional conformal sets as an uncertainty diagnostic, AoA as an applicability gate, and a fold-specific calibration risk threshold as the release gate. A sample is eligible for automatic mapping only when its prediction set contains one class, it lies inside the AoA, and its top probability passes a threshold selected without test labels. Samples outside AoA, larger conformal sets, singleton cases below the calibration risk threshold, non-evaluable classes, or folds with no certifiable risk threshold are sent to field verification or refused for automated mapping.</w:t>
+        <w:t>The trust-action layer is the central CEA contribution. The final pipeline uses class-conditional conformal sets as an uncertainty diagnostic, AoA as an applicability gate, and a fold-specific calibration risk threshold as the release gate. A sample is eligible for automatic mapping only when its prediction set contains one class, it lies inside the AoA, and its top probability passes a threshold selected without test labels. Samples outside AoA, larger conformal sets, singleton cases below the calibration risk threshold, non-evaluable classes, or folds with no certifiable risk threshold are sent to field verification or refused for automated mapping. Table 5 summarizes this action mapping.</w:t>
       </w:r>
     </w:p>
     <w:p>
@@ -2843,10 +2831,7 @@
         <w:rPr/>
       </w:pPr>
       <w:r>
-        <w:rPr>
-          <w:rtl w:val="0"/>
-        </w:rPr>
-        <w:t xml:space="preserve">The final evaluation resolves the earlier split mismatch by evaluating classifier accuracy and router actions inside the same outer spatial folds. Under the standard zero-leakage folds, B3 achieved mean OA 0.460 and macro-F1 0.331 across all 524 outer-test samples when the classifier was forced to return a label for every sample. The support-aware analysis treats that all-sample classifier output as a stress diagnostic rather than a release denominator. The support-aware router could be evaluated on 174 retained-class test samples after applying the configured calibration support rule; the other 350 samples were sent directly to field verification or refusal. In this common spatial-CV denominator, singleton set size alone was not reliable, while the combined AoA and calibration risk gate produced a smaller but substantially safer auto-map queue. Table 6 and Fig. 2 summarize the stack-level performance and release decisions.</w:t>
+        <w:t>The final evaluation resolves the earlier split mismatch by evaluating classifier accuracy and router actions inside the same outer spatial folds. Under the standard zero-leakage folds, B3 achieved mean OA 0.460 and macro-F1 0.331 across all 524 outer-test samples when the classifier was forced to return a label for every sample. The support-aware analysis treats that all-sample classifier output as a stress diagnostic rather than a release denominator. The support-aware router could be evaluated on 174 retained-class test samples after applying the configured calibration support rule; the other 350 samples were sent directly to field verification or refusal. In this common spatial-CV denominator, singleton set size alone was not reliable, while the combined AoA and calibration risk gate produced a smaller but substantially safer auto-map queue. Table 6 and Fig. 2 summarize the stack-level performance and release decisions. Table 6 and Table 7 report the paired performance and support accounting.</w:t>
       </w:r>
     </w:p>
     <w:p>
@@ -5125,10 +5110,7 @@
         <w:rPr/>
       </w:pPr>
       <w:r>
-        <w:rPr>
-          <w:rtl w:val="0"/>
-        </w:rPr>
-        <w:t xml:space="preserve">For the B3 outer spatial cross-fit at a 20% audit budget, the budget experiment is restricted to the 174 router-evaluable retained-class samples because the 350 non-evaluable samples have no conformal/probability action and are already routed to field verification or refusal. Within that evaluable denominator, a 20% audit inspects 35 samples. Class-conditional conformal set-size prioritization captured 16 of 63 verified-key errors, while a random audit was expected to capture 12.7. Low-confidence and low-margin prioritization captured 15 and 16 errors, respectively. These policies are reported as uncertainty-ranking diagnostics, not as field-proven cost savings. Table 8 and Fig. 3 summarize the audit-budget comparison.</w:t>
+        <w:t>For the B3 outer spatial cross-fit at a 20% audit budget, the budget experiment is restricted to the 174 router-evaluable retained-class samples because the 350 non-evaluable samples have no conformal/probability action and are already routed to field verification or refusal. Within that evaluable denominator, a 20% audit inspects 35 samples. Class-conditional conformal set-size prioritization captured 16 of 63 verified-key errors, while a random audit was expected to capture 12.7. Low-confidence and low-margin prioritization captured 15 and 16 errors, respectively. These policies are reported as uncertainty-ranking diagnostics, not as field-proven cost savings. Table 8 and Fig. 3 summarize the audit-budget comparison. Table 8 reports the 20% audit-share comparison.</w:t>
       </w:r>
     </w:p>
     <w:p>
@@ -6350,7 +6332,7 @@
         <w:rPr/>
       </w:pPr>
       <w:r>
-        <w:t>The scientific consequence is to weaken, not decorate, the claim. The manuscript does not use the historical remote-audit queue rates as current validation evidence. Instead, it reports the membership overlap as a reproducibility gate and reports the completed R2 blind second-reader audit as remote visual inter-reader agreement, not as in-situ validation.</w:t>
+        <w:t>The scientific consequence is to weaken, not decorate, the claim. The manuscript does not use the historical remote-audit queue rates as current validation evidence. Instead, it reports the membership overlap as a reproducibility gate and reports the completed R2 blind second-reader audit as remote visual inter-reader agreement, not as in-situ validation. Table 9 summarizes both the historical alignment and completed R2 visual-agreement audit.</w:t>
       </w:r>
     </w:p>
     <w:p>
@@ -6843,10 +6825,7 @@
         <w:rPr/>
       </w:pPr>
       <w:r>
-        <w:rPr>
-          <w:rtl w:val="0"/>
-        </w:rPr>
-        <w:t xml:space="preserve">The public ground-view search did not find automatically returned public ground-view candidates for any B3 outer spatial cross-fit sample (0 of 524). This negative result is important because it prevents the manuscript from replacing missing in-situ data with unsupported public-image claims. The result supports the decision-support interpretation: the workflow can create a reproducible queue of places where remote, public, and satellite evidence should be inspected first, but it still cannot claim ground truth from field observations.</w:t>
+        <w:t>The public ground-view search did not find automatically returned public ground-view candidates for any B3 outer spatial cross-fit sample (0 of 524). This negative result is important because it prevents the manuscript from replacing missing in-situ data with unsupported public-image claims. The result supports the decision-support interpretation: the workflow can create a reproducible queue of places where remote, public, and satellite evidence should be inspected first, but it still cannot claim ground truth from field observations. Table 10 and Table 11 summarize the zero-found result, and Figure S1 and Figure S2 visualize queue availability and query status.</w:t>
       </w:r>
     </w:p>
     <w:p>
@@ -8503,10 +8482,7 @@
         <w:rPr/>
       </w:pPr>
       <w:r>
-        <w:rPr>
-          <w:rtl w:val="0"/>
-        </w:rPr>
-        <w:t xml:space="preserve">The class-level contamination is agriculturally meaningful. Rubber was collapsed to forest in 53 WorldCover-hint rows and 53 Dynamic World-hint rows. Paddy was collapsed to other agriculture in 25 WorldCover rows and 23 Dynamic World rows. These are not minor label differences; they affect crop inventory and field-survey routing.</w:t>
+        <w:t>The class-level contamination is agriculturally meaningful. Rubber was collapsed to forest in 53 WorldCover-hint rows and 53 Dynamic World-hint rows. Paddy was collapsed to other agriculture in 25 WorldCover rows and 23 Dynamic World rows. These are not minor label differences; they affect crop inventory and field-survey routing. Table 12 and Figure S3 summarize this weak-reference contamination.</w:t>
       </w:r>
     </w:p>
     <w:p>
@@ -9108,10 +9084,7 @@
         <w:rPr/>
       </w:pPr>
       <w:r>
-        <w:rPr>
-          <w:rtl w:val="0"/>
-        </w:rPr>
-        <w:t xml:space="preserve">AoA was added as a second, distance-based safety gate alongside conformal set size. In the earlier single spatial conformal diagnostic, B2 marked 17 of 110 samples outside the AoA, whereas B3 marked 5 of 110 outside. This difference follows from stack-specific feature geometry and calibration thresholds: the B2 DI threshold was 1.458, while the B3 threshold was 1.712. In the final B3 outer spatial cross-fit, 96 of 174 retained-class decisions were inside the AoA and 78 were outside. Because the current samples come from one broad connected study system, AoA is best interpreted as a deployment safety gate for future distribution shift rather than as proof of an enriched singleton-error detector in the present data. Fig. 4 shows the AoA and conformal routing diagnostics.</w:t>
+        <w:t>AoA was added as a second, distance-based safety gate alongside conformal set size. In the earlier single spatial conformal diagnostic, B2 marked 17 of 110 samples outside the AoA, whereas B3 marked 5 of 110 outside. This difference follows from stack-specific feature geometry and calibration thresholds: the B2 DI threshold was 1.458, while the B3 threshold was 1.712. In the final B3 outer spatial cross-fit, 96 of 174 retained-class decisions were inside the AoA and 78 were outside. Because the current samples come from one broad connected study system, AoA is best interpreted as a deployment safety gate for future distribution shift rather than as proof of an enriched singleton-error detector in the present data.  Table 13 summarizes AoA membership, Table 14 summarizes action-policy routing, and Fig. 4 shows the AoA and conformal routing diagnostics.</w:t>
       </w:r>
     </w:p>
     <w:p>
@@ -12878,10 +12851,7 @@
         <w:rPr/>
       </w:pPr>
       <w:r>
-        <w:rPr>
-          <w:rtl w:val="0"/>
-        </w:rPr>
-        <w:t xml:space="preserve">The selected indicator-variogram block distance is approximately 151 km. The spatial-block accuracy rows are not monotonic because the four-fold composition changes as the block distance changes; with only four folds, shifts in which spatial blocks enter each test partition can dominate any smooth distance trend. The support-density diagnostic adds the missing class-support view: under the locked six-class legend, the approximately 83.0 km diagnostic block retained only 77/524 samples, and the 0.25x diagnostic retained 217/524. Coarse legends can recover support, with the three-class agriculture/forest/built-up diagnostic retaining 445/524 at 151 km, but this changes the map product. Table 16 reports forced-label accuracy sensitivity; Table 17 reports the support-density frontier.</w:t>
+        <w:t>The selected indicator-variogram block distance is approximately 151 km. The spatial-block accuracy rows are not monotonic because the four-fold composition changes as the block distance changes; with only four folds, shifts in which spatial blocks enter each test partition can dominate any smooth distance trend. The support-density diagnostic adds the missing class-support view: under the locked six-class legend, the approximately 83.0 km diagnostic block retained only 77/524 samples, and the 0.25x diagnostic retained 217/524. Coarse legends can recover support, with the three-class agriculture/forest/built-up diagnostic retaining 445/524 at 151 km, but this changes the map product. Table 16 reports forced-label accuracy sensitivity; Table 17 reports the support-density frontier. Figure 6 visualizes the same block-sensitivity result and effective folds.</w:t>
       </w:r>
     </w:p>
     <w:p>
@@ -15324,7 +15294,7 @@
         <w:rPr/>
       </w:pPr>
       <w:r>
-        <w:t>No geotagged in-situ field survey or public DOI/stable public release for the exact CEA R12 package was supplied. The completed R2 table addresses the previous second-annotator MISSING gate for readable-pair remote visual agreement, but it does not convert the reference labels into field truth. These remaining gates are therefore unresolved rather than inferred.</w:t>
+        <w:t>No geotagged in-situ field survey or DOI-bearing public archive for the exact CEA R12 package was supplied. A stable public GitHub tag archive is provided for this final package at https://github.com/wenzhedai57-coder/spatial-validation-geoai-smallholder-mapping/tree/cea-r12-final-public-archive-qa-20260620. The completed R2 table addresses the previous second-annotator MISSING gate for readable-pair remote visual agreement, but it does not convert the reference labels into field truth. The remaining field-truth and DOI-bearing archive gates are therefore unresolved rather than inferred.</w:t>
       </w:r>
     </w:p>
     <w:p>
@@ -15387,7 +15357,7 @@
         <w:rPr/>
       </w:pPr>
       <w:r>
-        <w:t>All reported numeric results are read from CSV/JSON artifacts generated by repository scripts. The current build adds class-conditional outer spatial cross-fitted router tables, risk-threshold tables, denominator accounting, rerun open-evidence outputs, fold-design audits, optimized-fold sensitivity outputs, and second-reader agreement artifacts while preserving the variogram and weak-reference audit artifacts. Missing, unreadable, or unsupported results are reported as SKIPPED, MISSING, or ERROR rather than replaced with plausible values.</w:t>
+        <w:t>All reported numeric results are read from CSV/JSON artifacts generated by repository scripts. The current build adds class-conditional outer spatial cross-fitted router tables, risk-threshold tables, denominator accounting, rerun open-evidence outputs, fold-design audits, optimized-fold sensitivity outputs, and second-reader agreement artifacts while preserving the variogram and weak-reference audit artifacts. Missing, unreadable, or unsupported results are reported as SKIPPED, MISSING, or ERROR rather than replaced with plausible values. Table 18 indexes the evidence files for these manuscript claims.</w:t>
       </w:r>
     </w:p>
     <w:p>
@@ -16211,10 +16181,7 @@
         <w:rPr/>
       </w:pPr>
       <w:r>
-        <w:rPr>
-          <w:rtl w:val="0"/>
-        </w:rPr>
-        <w:t>Data and code availability: The generated artifacts supporting this manuscript are included in the accompanying reproducibility package CEA_R12_LATEST_RELATED_DATA_FIGURES_PACKAGE_20260615, which contains PACKAGE_MANIFEST.csv, PACKAGE_SUMMARY.json, PACKAGE_VERIFY.json, source data, result CSV/JSON artifacts, figures, QA logs, and SHA256 checksums. Related public repository materials for the spatial-validation workflow are available at the stable GitHub commit URL https://github.com/wenzhedai57-coder/spatial-validation-geoai-smallholder-mapping/tree/440c4225c34e77d6d709783ec02b1c5299d00bf1. A public archive DOI or stable public release for the exact CEA R12 package still needs to be minted before final journal upload.</w:t>
+        <w:t>Data and code availability: The generated artifacts supporting this manuscript are included in the accompanying reproducibility package CEA_R12_FINAL_PUBLIC_ARCHIVE_QA_PACKAGE_20260620.zip, which contains the manuscript, manuscript figures, result CSV/JSON evidence, second-reader evidence, final QA logs, PACKAGE_MANIFEST.csv, PACKAGE_SUMMARY.json, PACKAGE_VERIFY.json, and SHA256 checksums. The same package and repository materials are available at the stable GitHub tag URL https://github.com/wenzhedai57-coder/spatial-validation-geoai-smallholder-mapping/tree/cea-r12-final-public-archive-qa-20260620 and tag archive URL https://github.com/wenzhedai57-coder/spatial-validation-geoai-smallholder-mapping/archive/refs/tags/cea-r12-final-public-archive-qa-20260620.zip. The tag provides a stable public archive link; no DOI has been minted for this package.</w:t>
       </w:r>
     </w:p>
     <w:p>

</xml_diff>